<commit_message>
Update experience copy and CV
</commit_message>
<xml_diff>
--- a/public/Qingyi_Lu_CV.docx
+++ b/public/Qingyi_Lu_CV.docx
@@ -11,12 +11,21 @@
           <w:rFonts w:eastAsiaTheme="minorEastAsia"/>
         </w:rPr>
       </w:pPr>
+      <w:proofErr w:type="gramStart"/>
       <w:r>
         <w:rPr>
           <w:rFonts w:ascii="Calibri" w:eastAsiaTheme="minorEastAsia" w:hAnsi="Calibri" w:cs="Calibri" w:hint="eastAsia"/>
           <w:sz w:val="52"/>
         </w:rPr>
-        <w:t xml:space="preserve">Qingyi(Eddie) </w:t>
+        <w:t>Qingyi(</w:t>
+      </w:r>
+      <w:proofErr w:type="gramEnd"/>
+      <w:r>
+        <w:rPr>
+          <w:rFonts w:ascii="Calibri" w:eastAsiaTheme="minorEastAsia" w:hAnsi="Calibri" w:cs="Calibri" w:hint="eastAsia"/>
+          <w:sz w:val="52"/>
+        </w:rPr>
+        <w:t xml:space="preserve">Eddie) </w:t>
       </w:r>
       <w:r>
         <w:rPr>
@@ -137,7 +146,7 @@
         <w:ind w:left="-5"/>
         <w:jc w:val="both"/>
         <w:rPr>
-          <w:rFonts w:eastAsiaTheme="minorEastAsia" w:hint="eastAsia"/>
+          <w:rFonts w:eastAsiaTheme="minorEastAsia"/>
         </w:rPr>
       </w:pPr>
       <w:r>
@@ -274,16 +283,77 @@
         </w:rPr>
         <w:t xml:space="preserve"> </w:t>
       </w:r>
-      <w:r>
-        <w:rPr>
-          <w:rFonts w:ascii="Cambria" w:eastAsia="Cambria" w:hAnsi="Cambria" w:cs="Cambria"/>
-          <w:color w:val="000000"/>
-          <w:kern w:val="2"/>
-          <w:sz w:val="22"/>
-          <w:szCs w:val="22"/>
-          <w14:ligatures w14:val="standardContextual"/>
-        </w:rPr>
-        <w:t>Specialised in modernising legacy systems, designing reusable component architectures, and delivering responsive, accessible user interfaces. Strong experience collaborating with cross-functional teams to translate complex product requirements into maintainable frontend solutions, optimise performance, and deliver reliable user experiences in Agile environments.</w:t>
+      <w:proofErr w:type="spellStart"/>
+      <w:r>
+        <w:rPr>
+          <w:rFonts w:ascii="Cambria" w:eastAsia="Cambria" w:hAnsi="Cambria" w:cs="Cambria"/>
+          <w:color w:val="000000"/>
+          <w:kern w:val="2"/>
+          <w:sz w:val="22"/>
+          <w:szCs w:val="22"/>
+          <w14:ligatures w14:val="standardContextual"/>
+        </w:rPr>
+        <w:t>Specialised</w:t>
+      </w:r>
+      <w:proofErr w:type="spellEnd"/>
+      <w:r>
+        <w:rPr>
+          <w:rFonts w:ascii="Cambria" w:eastAsia="Cambria" w:hAnsi="Cambria" w:cs="Cambria"/>
+          <w:color w:val="000000"/>
+          <w:kern w:val="2"/>
+          <w:sz w:val="22"/>
+          <w:szCs w:val="22"/>
+          <w14:ligatures w14:val="standardContextual"/>
+        </w:rPr>
+        <w:t xml:space="preserve"> in </w:t>
+      </w:r>
+      <w:proofErr w:type="spellStart"/>
+      <w:r>
+        <w:rPr>
+          <w:rFonts w:ascii="Cambria" w:eastAsia="Cambria" w:hAnsi="Cambria" w:cs="Cambria"/>
+          <w:color w:val="000000"/>
+          <w:kern w:val="2"/>
+          <w:sz w:val="22"/>
+          <w:szCs w:val="22"/>
+          <w14:ligatures w14:val="standardContextual"/>
+        </w:rPr>
+        <w:t>modernising</w:t>
+      </w:r>
+      <w:proofErr w:type="spellEnd"/>
+      <w:r>
+        <w:rPr>
+          <w:rFonts w:ascii="Cambria" w:eastAsia="Cambria" w:hAnsi="Cambria" w:cs="Cambria"/>
+          <w:color w:val="000000"/>
+          <w:kern w:val="2"/>
+          <w:sz w:val="22"/>
+          <w:szCs w:val="22"/>
+          <w14:ligatures w14:val="standardContextual"/>
+        </w:rPr>
+        <w:t xml:space="preserve"> legacy systems, designing reusable component architectures, and delivering responsive, accessible user interfaces. Strong experience collaborating with cross-functional teams to translate complex product requirements into maintainable frontend solutions, </w:t>
+      </w:r>
+      <w:proofErr w:type="spellStart"/>
+      <w:r>
+        <w:rPr>
+          <w:rFonts w:ascii="Cambria" w:eastAsia="Cambria" w:hAnsi="Cambria" w:cs="Cambria"/>
+          <w:color w:val="000000"/>
+          <w:kern w:val="2"/>
+          <w:sz w:val="22"/>
+          <w:szCs w:val="22"/>
+          <w14:ligatures w14:val="standardContextual"/>
+        </w:rPr>
+        <w:t>optimise</w:t>
+      </w:r>
+      <w:proofErr w:type="spellEnd"/>
+      <w:r>
+        <w:rPr>
+          <w:rFonts w:ascii="Cambria" w:eastAsia="Cambria" w:hAnsi="Cambria" w:cs="Cambria"/>
+          <w:color w:val="000000"/>
+          <w:kern w:val="2"/>
+          <w:sz w:val="22"/>
+          <w:szCs w:val="22"/>
+          <w14:ligatures w14:val="standardContextual"/>
+        </w:rPr>
+        <w:t xml:space="preserve"> performance, and deliver reliable user experiences in Agile environments.</w:t>
       </w:r>
     </w:p>
     <w:p>
@@ -344,7 +414,31 @@
           <w:szCs w:val="22"/>
           <w14:ligatures w14:val="standardContextual"/>
         </w:rPr>
-        <w:t>React, TypeScript, Next.js, JavaScript (ES2015+), HTML5, CSS3/SCSS/SASS, Tailwind CSS, Vue 2/3, Redux, MobX, React Router</w:t>
+        <w:t xml:space="preserve">React, TypeScript, Next.js, JavaScript (ES2015+), HTML5, CSS3/SCSS/SASS, Tailwind CSS, Vue 2/3, Redux, </w:t>
+      </w:r>
+      <w:proofErr w:type="spellStart"/>
+      <w:r>
+        <w:rPr>
+          <w:rFonts w:ascii="Cambria" w:eastAsia="Cambria" w:hAnsi="Cambria" w:cs="Cambria"/>
+          <w:color w:val="000000"/>
+          <w:kern w:val="2"/>
+          <w:sz w:val="22"/>
+          <w:szCs w:val="22"/>
+          <w14:ligatures w14:val="standardContextual"/>
+        </w:rPr>
+        <w:t>MobX</w:t>
+      </w:r>
+      <w:proofErr w:type="spellEnd"/>
+      <w:r>
+        <w:rPr>
+          <w:rFonts w:ascii="Cambria" w:eastAsia="Cambria" w:hAnsi="Cambria" w:cs="Cambria"/>
+          <w:color w:val="000000"/>
+          <w:kern w:val="2"/>
+          <w:sz w:val="22"/>
+          <w:szCs w:val="22"/>
+          <w14:ligatures w14:val="standardContextual"/>
+        </w:rPr>
+        <w:t>, React Router</w:t>
       </w:r>
     </w:p>
     <w:p>
@@ -370,7 +464,35 @@
           <w:szCs w:val="22"/>
           <w14:ligatures w14:val="standardContextual"/>
         </w:rPr>
-        <w:t>UI &amp; Visualisation:</w:t>
+        <w:t xml:space="preserve">UI &amp; </w:t>
+      </w:r>
+      <w:proofErr w:type="spellStart"/>
+      <w:r>
+        <w:rPr>
+          <w:rFonts w:ascii="Cambria" w:eastAsia="Cambria" w:hAnsi="Cambria" w:cs="Cambria"/>
+          <w:b/>
+          <w:bCs/>
+          <w:color w:val="000000"/>
+          <w:kern w:val="2"/>
+          <w:sz w:val="22"/>
+          <w:szCs w:val="22"/>
+          <w14:ligatures w14:val="standardContextual"/>
+        </w:rPr>
+        <w:t>Visualisation</w:t>
+      </w:r>
+      <w:proofErr w:type="spellEnd"/>
+      <w:r>
+        <w:rPr>
+          <w:rFonts w:ascii="Cambria" w:eastAsia="Cambria" w:hAnsi="Cambria" w:cs="Cambria"/>
+          <w:b/>
+          <w:bCs/>
+          <w:color w:val="000000"/>
+          <w:kern w:val="2"/>
+          <w:sz w:val="22"/>
+          <w:szCs w:val="22"/>
+          <w14:ligatures w14:val="standardContextual"/>
+        </w:rPr>
+        <w:t>:</w:t>
       </w:r>
       <w:r>
         <w:rPr>
@@ -394,6 +516,7 @@
         </w:rPr>
         <w:t xml:space="preserve">Component-driven development, Design Systems, Pattern Libraries, Ant Design, Element UI, </w:t>
       </w:r>
+      <w:proofErr w:type="spellStart"/>
       <w:r>
         <w:rPr>
           <w:rFonts w:ascii="Cambria" w:eastAsia="Cambria" w:hAnsi="Cambria" w:cs="Cambria" w:hint="eastAsia"/>
@@ -414,7 +537,19 @@
           <w:szCs w:val="22"/>
           <w14:ligatures w14:val="standardContextual"/>
         </w:rPr>
-        <w:t xml:space="preserve">hadcn </w:t>
+        <w:t>hadcn</w:t>
+      </w:r>
+      <w:proofErr w:type="spellEnd"/>
+      <w:r>
+        <w:rPr>
+          <w:rFonts w:ascii="Cambria" w:eastAsia="Cambria" w:hAnsi="Cambria" w:cs="Cambria"/>
+          <w:color w:val="000000"/>
+          <w:kern w:val="2"/>
+          <w:sz w:val="22"/>
+          <w:szCs w:val="22"/>
+          <w14:ligatures w14:val="standardContextual"/>
+        </w:rPr>
+        <w:t xml:space="preserve"> </w:t>
       </w:r>
       <w:r>
         <w:rPr>
@@ -427,16 +562,42 @@
         </w:rPr>
         <w:t xml:space="preserve">UI, </w:t>
       </w:r>
-      <w:r>
-        <w:rPr>
-          <w:rFonts w:ascii="Cambria" w:eastAsia="Cambria" w:hAnsi="Cambria" w:cs="Cambria"/>
-          <w:color w:val="000000"/>
-          <w:kern w:val="2"/>
-          <w:sz w:val="22"/>
-          <w:szCs w:val="22"/>
-          <w14:ligatures w14:val="standardContextual"/>
-        </w:rPr>
-        <w:t>ECharts, D3.js, Three.js</w:t>
+      <w:proofErr w:type="spellStart"/>
+      <w:r>
+        <w:rPr>
+          <w:rFonts w:ascii="Cambria" w:eastAsia="Cambria" w:hAnsi="Cambria" w:cs="Cambria"/>
+          <w:color w:val="000000"/>
+          <w:kern w:val="2"/>
+          <w:sz w:val="22"/>
+          <w:szCs w:val="22"/>
+          <w14:ligatures w14:val="standardContextual"/>
+        </w:rPr>
+        <w:t>ECharts</w:t>
+      </w:r>
+      <w:proofErr w:type="spellEnd"/>
+      <w:r>
+        <w:rPr>
+          <w:rFonts w:ascii="Cambria" w:eastAsia="Cambria" w:hAnsi="Cambria" w:cs="Cambria"/>
+          <w:color w:val="000000"/>
+          <w:kern w:val="2"/>
+          <w:sz w:val="22"/>
+          <w:szCs w:val="22"/>
+          <w14:ligatures w14:val="standardContextual"/>
+        </w:rPr>
+        <w:t xml:space="preserve">, D3.js, </w:t>
+      </w:r>
+      <w:proofErr w:type="spellStart"/>
+      <w:proofErr w:type="gramStart"/>
+      <w:r>
+        <w:rPr>
+          <w:rFonts w:ascii="Cambria" w:eastAsia="Cambria" w:hAnsi="Cambria" w:cs="Cambria"/>
+          <w:color w:val="000000"/>
+          <w:kern w:val="2"/>
+          <w:sz w:val="22"/>
+          <w:szCs w:val="22"/>
+          <w14:ligatures w14:val="standardContextual"/>
+        </w:rPr>
+        <w:t>Three.js</w:t>
       </w:r>
       <w:r>
         <w:rPr>
@@ -471,6 +632,8 @@
         </w:rPr>
         <w:t>vas</w:t>
       </w:r>
+      <w:proofErr w:type="spellEnd"/>
+      <w:proofErr w:type="gramEnd"/>
     </w:p>
     <w:p>
       <w:pPr>
@@ -561,7 +724,31 @@
           <w:szCs w:val="22"/>
           <w14:ligatures w14:val="standardContextual"/>
         </w:rPr>
-        <w:t>, Performance Optimisation &amp; Budgeting</w:t>
+        <w:t xml:space="preserve">, Performance </w:t>
+      </w:r>
+      <w:proofErr w:type="spellStart"/>
+      <w:r>
+        <w:rPr>
+          <w:rFonts w:ascii="Cambria" w:eastAsia="Cambria" w:hAnsi="Cambria" w:cs="Cambria"/>
+          <w:color w:val="000000"/>
+          <w:kern w:val="2"/>
+          <w:sz w:val="22"/>
+          <w:szCs w:val="22"/>
+          <w14:ligatures w14:val="standardContextual"/>
+        </w:rPr>
+        <w:t>Optimisation</w:t>
+      </w:r>
+      <w:proofErr w:type="spellEnd"/>
+      <w:r>
+        <w:rPr>
+          <w:rFonts w:ascii="Cambria" w:eastAsia="Cambria" w:hAnsi="Cambria" w:cs="Cambria"/>
+          <w:color w:val="000000"/>
+          <w:kern w:val="2"/>
+          <w:sz w:val="22"/>
+          <w:szCs w:val="22"/>
+          <w14:ligatures w14:val="standardContextual"/>
+        </w:rPr>
+        <w:t xml:space="preserve"> &amp; Budgeting</w:t>
       </w:r>
     </w:p>
     <w:p>
@@ -609,7 +796,31 @@
           <w:szCs w:val="22"/>
           <w14:ligatures w14:val="standardContextual"/>
         </w:rPr>
-        <w:t>Webpack, Vite, npm/yarn, Node.js Jest, React Testing Library</w:t>
+        <w:t xml:space="preserve">Webpack, Vite, </w:t>
+      </w:r>
+      <w:proofErr w:type="spellStart"/>
+      <w:r>
+        <w:rPr>
+          <w:rFonts w:ascii="Cambria" w:eastAsia="Cambria" w:hAnsi="Cambria" w:cs="Cambria"/>
+          <w:color w:val="000000"/>
+          <w:kern w:val="2"/>
+          <w:sz w:val="22"/>
+          <w:szCs w:val="22"/>
+          <w14:ligatures w14:val="standardContextual"/>
+        </w:rPr>
+        <w:t>npm</w:t>
+      </w:r>
+      <w:proofErr w:type="spellEnd"/>
+      <w:r>
+        <w:rPr>
+          <w:rFonts w:ascii="Cambria" w:eastAsia="Cambria" w:hAnsi="Cambria" w:cs="Cambria"/>
+          <w:color w:val="000000"/>
+          <w:kern w:val="2"/>
+          <w:sz w:val="22"/>
+          <w:szCs w:val="22"/>
+          <w14:ligatures w14:val="standardContextual"/>
+        </w:rPr>
+        <w:t>/yarn, Node.js Jest, React Testing Library</w:t>
       </w:r>
     </w:p>
     <w:p>
@@ -657,7 +868,31 @@
           <w:szCs w:val="22"/>
           <w14:ligatures w14:val="standardContextual"/>
         </w:rPr>
-        <w:t>RESTful APIs, FastAPI (Python), frontend-backend integration</w:t>
+        <w:t xml:space="preserve">RESTful APIs, </w:t>
+      </w:r>
+      <w:proofErr w:type="spellStart"/>
+      <w:r>
+        <w:rPr>
+          <w:rFonts w:ascii="Cambria" w:eastAsia="Cambria" w:hAnsi="Cambria" w:cs="Cambria"/>
+          <w:color w:val="000000"/>
+          <w:kern w:val="2"/>
+          <w:sz w:val="22"/>
+          <w:szCs w:val="22"/>
+          <w14:ligatures w14:val="standardContextual"/>
+        </w:rPr>
+        <w:t>FastAPI</w:t>
+      </w:r>
+      <w:proofErr w:type="spellEnd"/>
+      <w:r>
+        <w:rPr>
+          <w:rFonts w:ascii="Cambria" w:eastAsia="Cambria" w:hAnsi="Cambria" w:cs="Cambria"/>
+          <w:color w:val="000000"/>
+          <w:kern w:val="2"/>
+          <w:sz w:val="22"/>
+          <w:szCs w:val="22"/>
+          <w14:ligatures w14:val="standardContextual"/>
+        </w:rPr>
+        <w:t xml:space="preserve"> (Python), frontend-backend integration</w:t>
       </w:r>
       <w:r>
         <w:rPr>
@@ -887,12 +1122,14 @@
       <w:r>
         <w:t xml:space="preserve">Collaborated with a teammate to design and develop a custom booking website, covering requirement discussions, UX design, full-stack development, and deployment on </w:t>
       </w:r>
+      <w:proofErr w:type="spellStart"/>
       <w:r>
         <w:rPr>
           <w:rStyle w:val="whitespace-normal"/>
         </w:rPr>
         <w:t>Vercel</w:t>
       </w:r>
+      <w:proofErr w:type="spellEnd"/>
       <w:r>
         <w:t>.</w:t>
       </w:r>
@@ -971,8 +1208,16 @@
         <w:rPr>
           <w:rFonts w:eastAsiaTheme="minorEastAsia" w:hint="eastAsia"/>
         </w:rPr>
-        <w:t>, Nextjs</w:t>
-      </w:r>
+        <w:t xml:space="preserve">, </w:t>
+      </w:r>
+      <w:proofErr w:type="spellStart"/>
+      <w:r>
+        <w:rPr>
+          <w:rFonts w:eastAsiaTheme="minorEastAsia" w:hint="eastAsia"/>
+        </w:rPr>
+        <w:t>Nextjs</w:t>
+      </w:r>
+      <w:proofErr w:type="spellEnd"/>
       <w:r>
         <w:t>, TypeScript, PostgreSQL, Git</w:t>
       </w:r>
@@ -998,8 +1243,16 @@
         <w:rPr>
           <w:rFonts w:eastAsiaTheme="minorEastAsia" w:hint="eastAsia"/>
         </w:rPr>
-        <w:t>, Vercel</w:t>
-      </w:r>
+        <w:t xml:space="preserve">, </w:t>
+      </w:r>
+      <w:proofErr w:type="spellStart"/>
+      <w:r>
+        <w:rPr>
+          <w:rFonts w:eastAsiaTheme="minorEastAsia" w:hint="eastAsia"/>
+        </w:rPr>
+        <w:t>Vercel</w:t>
+      </w:r>
+      <w:proofErr w:type="spellEnd"/>
     </w:p>
     <w:p>
       <w:pPr>
@@ -1053,12 +1306,14 @@
           <w:rFonts w:eastAsiaTheme="minorEastAsia"/>
         </w:rPr>
       </w:pPr>
+      <w:proofErr w:type="spellStart"/>
       <w:r>
         <w:t>J</w:t>
       </w:r>
       <w:r>
         <w:t>fhealthcare</w:t>
       </w:r>
+      <w:proofErr w:type="spellEnd"/>
       <w:r>
         <w:t xml:space="preserve"> Technology Co., Ltd </w:t>
       </w:r>
@@ -1099,7 +1354,15 @@
           <w:b/>
           <w:bCs/>
         </w:rPr>
-        <w:t>Frontend Develop</w:t>
+        <w:t xml:space="preserve">Frontend </w:t>
+      </w:r>
+      <w:proofErr w:type="gramStart"/>
+      <w:r>
+        <w:rPr>
+          <w:b/>
+          <w:bCs/>
+        </w:rPr>
+        <w:t>Develop</w:t>
       </w:r>
       <w:r>
         <w:rPr>
@@ -1125,6 +1388,7 @@
         </w:rPr>
         <w:tab/>
       </w:r>
+      <w:proofErr w:type="gramEnd"/>
       <w:r>
         <w:rPr>
           <w:rFonts w:eastAsiaTheme="minorEastAsia"/>
@@ -1264,12 +1528,14 @@
           <w:rFonts w:eastAsiaTheme="minorEastAsia"/>
         </w:rPr>
       </w:pPr>
+      <w:proofErr w:type="spellStart"/>
       <w:r>
         <w:t>J</w:t>
       </w:r>
       <w:r>
         <w:t>fhealthcare</w:t>
       </w:r>
+      <w:proofErr w:type="spellEnd"/>
       <w:r>
         <w:t xml:space="preserve"> Technology focuses on AI-driven medical imaging and diagnostic platforms.</w:t>
       </w:r>
@@ -1705,17 +1971,8 @@
           <w:rFonts w:eastAsiaTheme="minorEastAsia"/>
         </w:rPr>
       </w:pPr>
-    </w:p>
-    <w:p>
-      <w:pPr>
-        <w:ind w:left="-5"/>
-        <w:jc w:val="both"/>
-        <w:rPr>
-          <w:rFonts w:eastAsiaTheme="minorEastAsia"/>
-        </w:rPr>
-      </w:pPr>
-      <w:r>
-        <w:t>A technology company primarily delivering customised software solutions for government departments and public sector digital transformation projects.</w:t>
+      <w:r>
+        <w:t>A core enterprise in big data governance and cybersecurity, delivering digital solutions for public safety, smart government, and smart city initiatives.</w:t>
       </w:r>
     </w:p>
     <w:p>
@@ -1746,10 +2003,7 @@
         <w:jc w:val="both"/>
       </w:pPr>
       <w:r>
-        <w:t>Contributed to 30+ commercial web applications for public-sector organisations (including law enforcement and customs departments).</w:t>
-      </w:r>
-      <w:r>
-        <w:t xml:space="preserve"> </w:t>
+        <w:t>Delivered 30+ web applications and internal platforms supporting public-sector and government-focused digital transformation projects.</w:t>
       </w:r>
     </w:p>
     <w:p>
@@ -1768,7 +2022,15 @@
         <w:jc w:val="both"/>
       </w:pPr>
       <w:r>
-        <w:t>Built data-intensive dashboards using React and ECharts for operational monitoring and analytics.</w:t>
+        <w:t xml:space="preserve">Built data-intensive dashboards using React and </w:t>
+      </w:r>
+      <w:proofErr w:type="spellStart"/>
+      <w:r>
+        <w:t>ECharts</w:t>
+      </w:r>
+      <w:proofErr w:type="spellEnd"/>
+      <w:r>
+        <w:t xml:space="preserve"> for operational monitoring and analytics.</w:t>
       </w:r>
       <w:r>
         <w:t xml:space="preserve"> </w:t>
@@ -1783,7 +2045,7 @@
         <w:jc w:val="both"/>
       </w:pPr>
       <w:r>
-        <w:t>Developed a React-based low-code platform that reduced internal development turnaround time.</w:t>
+        <w:t>Contributed to a React-based low-code platform that improved development efficiency and accelerated internal project delivery.</w:t>
       </w:r>
     </w:p>
     <w:p>
@@ -1794,29 +2056,13 @@
         </w:numPr>
         <w:jc w:val="both"/>
       </w:pPr>
-      <w:r>
-        <w:t>Helped modernise legacy internal systems (</w:t>
-      </w:r>
-      <w:r>
-        <w:rPr>
-          <w:rFonts w:eastAsiaTheme="minorEastAsia" w:hint="eastAsia"/>
-        </w:rPr>
-        <w:t xml:space="preserve">from </w:t>
-      </w:r>
-      <w:r>
-        <w:rPr>
-          <w:rFonts w:eastAsiaTheme="minorEastAsia" w:hint="eastAsia"/>
-        </w:rPr>
-        <w:t>j</w:t>
-      </w:r>
-      <w:r>
-        <w:t xml:space="preserve">Query/JSP </w:t>
-      </w:r>
-      <w:r>
-        <w:t>to</w:t>
-      </w:r>
-      <w:r>
-        <w:t xml:space="preserve"> React + ES6 + Webpack).</w:t>
+      <w:proofErr w:type="spellStart"/>
+      <w:r>
+        <w:t>Modernised</w:t>
+      </w:r>
+      <w:proofErr w:type="spellEnd"/>
+      <w:r>
+        <w:t xml:space="preserve"> legacy systems by migrating frontend modules from jQuery/JSP to React, ES6, and Webpack-based architectures.</w:t>
       </w:r>
     </w:p>
     <w:p>
@@ -1828,7 +2074,7 @@
         <w:jc w:val="both"/>
       </w:pPr>
       <w:r>
-        <w:t>Created reusable UI component libraries adopted across multiple teams.</w:t>
+        <w:t>Developed reusable UI components and shared frontend modules adopted across multiple project teams.</w:t>
       </w:r>
     </w:p>
     <w:p>
@@ -1976,8 +2222,16 @@
         <w:rPr>
           <w:rFonts w:eastAsiaTheme="minorEastAsia" w:hint="eastAsia"/>
         </w:rPr>
-        <w:t>Jiangsu Suwei</w:t>
-      </w:r>
+        <w:t xml:space="preserve">Jiangsu </w:t>
+      </w:r>
+      <w:proofErr w:type="spellStart"/>
+      <w:r>
+        <w:rPr>
+          <w:rFonts w:eastAsiaTheme="minorEastAsia" w:hint="eastAsia"/>
+        </w:rPr>
+        <w:t>Suwei</w:t>
+      </w:r>
+      <w:proofErr w:type="spellEnd"/>
       <w:r>
         <w:t xml:space="preserve"> Technology Co., Ltd (China) </w:t>
       </w:r>
@@ -2152,7 +2406,15 @@
         <w:t>software outsourcing company</w:t>
       </w:r>
       <w:r>
-        <w:t xml:space="preserve"> providing customised software development services for enterprise and government clients.</w:t>
+        <w:t xml:space="preserve"> providing </w:t>
+      </w:r>
+      <w:proofErr w:type="spellStart"/>
+      <w:r>
+        <w:t>customised</w:t>
+      </w:r>
+      <w:proofErr w:type="spellEnd"/>
+      <w:r>
+        <w:t xml:space="preserve"> software development services for enterprise and government clients.</w:t>
       </w:r>
     </w:p>
     <w:p>
@@ -2185,7 +2447,21 @@
         <w:rPr>
           <w:rFonts w:eastAsiaTheme="minorEastAsia"/>
         </w:rPr>
-        <w:t>Developed features for a robot inspection platform, including robot patrol trajectory visualisation, historical monitoring records, and reusable table components.</w:t>
+        <w:t xml:space="preserve">Developed features for a robot inspection platform, including robot patrol trajectory </w:t>
+      </w:r>
+      <w:proofErr w:type="spellStart"/>
+      <w:r>
+        <w:rPr>
+          <w:rFonts w:eastAsiaTheme="minorEastAsia"/>
+        </w:rPr>
+        <w:t>visualisation</w:t>
+      </w:r>
+      <w:proofErr w:type="spellEnd"/>
+      <w:r>
+        <w:rPr>
+          <w:rFonts w:eastAsiaTheme="minorEastAsia"/>
+        </w:rPr>
+        <w:t>, historical monitoring records, and reusable table components.</w:t>
       </w:r>
     </w:p>
     <w:p>
@@ -2236,6 +2512,8 @@
       <w:r>
         <w:t xml:space="preserve"> jQuery, </w:t>
       </w:r>
+      <w:proofErr w:type="spellStart"/>
+      <w:proofErr w:type="gramStart"/>
       <w:r>
         <w:rPr>
           <w:rFonts w:eastAsiaTheme="minorEastAsia" w:hint="eastAsia"/>
@@ -2249,7 +2527,12 @@
         <w:t>,</w:t>
       </w:r>
       <w:r>
-        <w:t xml:space="preserve">REST APIs, </w:t>
+        <w:t>REST</w:t>
+      </w:r>
+      <w:proofErr w:type="spellEnd"/>
+      <w:proofErr w:type="gramEnd"/>
+      <w:r>
+        <w:t xml:space="preserve"> APIs, </w:t>
       </w:r>
       <w:r>
         <w:rPr>
@@ -2290,19 +2573,10 @@
     </w:p>
     <w:p>
       <w:pPr>
-        <w:ind w:left="-5"/>
-        <w:jc w:val="both"/>
-        <w:rPr>
-          <w:rFonts w:ascii="宋体" w:eastAsiaTheme="minorEastAsia" w:hAnsi="宋体" w:cs="宋体"/>
-        </w:rPr>
-      </w:pPr>
-    </w:p>
-    <w:p>
-      <w:pPr>
         <w:ind w:left="0" w:firstLine="0"/>
         <w:jc w:val="both"/>
         <w:rPr>
-          <w:rFonts w:ascii="宋体" w:eastAsiaTheme="minorEastAsia" w:hAnsi="宋体" w:cs="宋体"/>
+          <w:rFonts w:ascii="宋体" w:eastAsiaTheme="minorEastAsia" w:hAnsi="宋体" w:cs="宋体" w:hint="eastAsia"/>
         </w:rPr>
       </w:pPr>
     </w:p>
@@ -2324,7 +2598,15 @@
         <w:jc w:val="both"/>
       </w:pPr>
       <w:r>
-        <w:t xml:space="preserve">Whitireia &amp; WelTec </w:t>
+        <w:t xml:space="preserve">Whitireia &amp; </w:t>
+      </w:r>
+      <w:proofErr w:type="spellStart"/>
+      <w:r>
+        <w:t>WelTec</w:t>
+      </w:r>
+      <w:proofErr w:type="spellEnd"/>
+      <w:r>
+        <w:t xml:space="preserve"> </w:t>
       </w:r>
     </w:p>
     <w:p>

</xml_diff>